<commit_message>
update watermark on sample paper
</commit_message>
<xml_diff>
--- a/topic-00-assessment/unit-2/talk-1-in-class-test/a-class-test.docx
+++ b/topic-00-assessment/unit-2/talk-1-in-class-test/a-class-test.docx
@@ -41,20 +41,7 @@
               <w:szCs w:val="44"/>
             </w:rPr>
             <w:br/>
-          </w:r>
-          <w:r>
-            <w:rPr>
-              <w:sz w:val="44"/>
-              <w:szCs w:val="44"/>
-            </w:rPr>
-            <w:t xml:space="preserve">SAMPLE </w:t>
-          </w:r>
-          <w:r>
-            <w:rPr>
-              <w:sz w:val="44"/>
-              <w:szCs w:val="44"/>
-            </w:rPr>
-            <w:t>In Class Exam</w:t>
+            <w:t>SAMPLE In Class Exam</w:t>
           </w:r>
           <w:r>
             <w:rPr>
@@ -63,13 +50,6 @@
             </w:rPr>
             <w:br/>
             <w:t>TIME : 1 HR</w:t>
-          </w:r>
-          <w:r>
-            <w:rPr>
-              <w:sz w:val="44"/>
-              <w:szCs w:val="44"/>
-            </w:rPr>
-            <w:br/>
           </w:r>
         </w:sdtContent>
       </w:sdt>
@@ -905,18 +885,7 @@
           <w:szCs w:val="24"/>
           <w:lang w:eastAsia="en-GB"/>
         </w:rPr>
-        <w:t>In each case, select one option</w:t>
-      </w:r>
-      <w:r>
-        <w:rPr>
-          <w:rFonts w:ascii="Times New Roman" w:eastAsia="Times New Roman" w:hAnsi="Times New Roman" w:cs="Times New Roman"/>
-          <w:i/>
-          <w:iCs/>
-          <w:sz w:val="24"/>
-          <w:szCs w:val="24"/>
-          <w:lang w:eastAsia="en-GB"/>
-        </w:rPr>
-        <w:t xml:space="preserve"> by circling the option letter. </w:t>
+        <w:t xml:space="preserve">In each case, select one option by circling the option letter. </w:t>
       </w:r>
     </w:p>
     <w:p>
@@ -5988,15 +5957,7 @@
           <w:spacing w:val="40"/>
           <w:sz w:val="20"/>
         </w:rPr>
-        <w:t xml:space="preserve"> </w:t>
-      </w:r>
-      <w:r>
-        <w:rPr>
-          <w:rFonts w:ascii="Times New Roman"/>
-          <w:spacing w:val="40"/>
-          <w:sz w:val="20"/>
-        </w:rPr>
-        <w:t xml:space="preserve"> </w:t>
+        <w:t xml:space="preserve">  </w:t>
       </w:r>
       <w:r>
         <w:rPr>
@@ -7111,12 +7072,6 @@
           <w:spacing w:val="-6"/>
         </w:rPr>
       </w:pPr>
-    </w:p>
-    <w:p>
-      <w:pPr>
-        <w:pStyle w:val="BodyText"/>
-        <w:spacing w:before="9"/>
-      </w:pPr>
       <w:r>
         <w:rPr>
           <w:noProof/>
@@ -7125,16 +7080,16 @@
         <mc:AlternateContent>
           <mc:Choice Requires="wps">
             <w:drawing>
-              <wp:anchor distT="0" distB="0" distL="0" distR="0" simplePos="0" relativeHeight="251715584" behindDoc="1" locked="0" layoutInCell="1" allowOverlap="1" wp14:anchorId="2BA08480" wp14:editId="4807E2B7">
+              <wp:anchor distT="0" distB="0" distL="0" distR="0" simplePos="0" relativeHeight="251715584" behindDoc="1" locked="0" layoutInCell="1" allowOverlap="1" wp14:anchorId="2BA08480" wp14:editId="7C24539C">
                 <wp:simplePos x="0" y="0"/>
                 <wp:positionH relativeFrom="page">
-                  <wp:posOffset>1298056</wp:posOffset>
+                  <wp:posOffset>1294765</wp:posOffset>
                 </wp:positionH>
                 <wp:positionV relativeFrom="paragraph">
-                  <wp:posOffset>36564</wp:posOffset>
+                  <wp:posOffset>170815</wp:posOffset>
                 </wp:positionV>
-                <wp:extent cx="1860550" cy="407670"/>
-                <wp:effectExtent l="0" t="0" r="19050" b="11430"/>
+                <wp:extent cx="1860550" cy="487045"/>
+                <wp:effectExtent l="0" t="0" r="19050" b="8255"/>
                 <wp:wrapTopAndBottom/>
                 <wp:docPr id="91" name="Textbox 91"/>
                 <wp:cNvGraphicFramePr>
@@ -7149,7 +7104,7 @@
                       <wps:spPr>
                         <a:xfrm>
                           <a:off x="0" y="0"/>
-                          <a:ext cx="1860550" cy="407670"/>
+                          <a:ext cx="1860550" cy="487045"/>
                         </a:xfrm>
                         <a:prstGeom prst="rect">
                           <a:avLst/>
@@ -7305,12 +7260,19 @@
                 <wp14:sizeRelH relativeFrom="margin">
                   <wp14:pctWidth>0</wp14:pctWidth>
                 </wp14:sizeRelH>
+                <wp14:sizeRelV relativeFrom="margin">
+                  <wp14:pctHeight>0</wp14:pctHeight>
+                </wp14:sizeRelV>
               </wp:anchor>
             </w:drawing>
           </mc:Choice>
           <mc:Fallback>
             <w:pict>
-              <v:shape w14:anchorId="2BA08480" id="Textbox 91" o:spid="_x0000_s1031" type="#_x0000_t202" style="position:absolute;margin-left:102.2pt;margin-top:2.9pt;width:146.5pt;height:32.1pt;z-index:-251600896;visibility:visible;mso-wrap-style:square;mso-width-percent:0;mso-wrap-distance-left:0;mso-wrap-distance-top:0;mso-wrap-distance-right:0;mso-wrap-distance-bottom:0;mso-position-horizontal:absolute;mso-position-horizontal-relative:page;mso-position-vertical:absolute;mso-position-vertical-relative:text;mso-width-percent:0;mso-width-relative:margin;v-text-anchor:top" o:gfxdata="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" fillcolor="#d6aebd [1305]" strokecolor="#8f949d" strokeweight=".19175mm">
+              <v:shapetype w14:anchorId="2BA08480" id="_x0000_t202" coordsize="21600,21600" o:spt="202" path="m,l,21600r21600,l21600,xe">
+                <v:stroke joinstyle="miter"/>
+                <v:path gradientshapeok="t" o:connecttype="rect"/>
+              </v:shapetype>
+              <v:shape id="Textbox 91" o:spid="_x0000_s1031" type="#_x0000_t202" style="position:absolute;margin-left:101.95pt;margin-top:13.45pt;width:146.5pt;height:38.35pt;z-index:-251600896;visibility:visible;mso-wrap-style:square;mso-width-percent:0;mso-height-percent:0;mso-wrap-distance-left:0;mso-wrap-distance-top:0;mso-wrap-distance-right:0;mso-wrap-distance-bottom:0;mso-position-horizontal:absolute;mso-position-horizontal-relative:page;mso-position-vertical:absolute;mso-position-vertical-relative:text;mso-width-percent:0;mso-height-percent:0;mso-width-relative:margin;mso-height-relative:margin;v-text-anchor:top" o:gfxdata="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" fillcolor="#d6aebd [1305]" strokecolor="#8f949d" strokeweight=".19175mm">
                 <v:path arrowok="t"/>
                 <v:textbox inset="0,0,0,0">
                   <w:txbxContent>
@@ -7447,6 +7409,12 @@
           </mc:Fallback>
         </mc:AlternateContent>
       </w:r>
+    </w:p>
+    <w:p>
+      <w:pPr>
+        <w:pStyle w:val="BodyText"/>
+        <w:spacing w:before="9"/>
+      </w:pPr>
       <w:r>
         <w:rPr>
           <w:color w:val="000D0E"/>
@@ -12028,7 +11996,7 @@
           <w:szCs w:val="24"/>
           <w:lang w:eastAsia="en-GB"/>
         </w:rPr>
-        <w:pict w14:anchorId="6975AB59">
+        <w:pict w14:anchorId="58916713">
           <v:rect id="_x0000_i1027" alt="" style="width:451.3pt;height:.05pt;mso-width-percent:0;mso-height-percent:0;mso-width-percent:0;mso-height-percent:0" o:hralign="center" o:hrstd="t" o:hr="t" fillcolor="#a0a0a0" stroked="f"/>
         </w:pict>
       </w:r>
@@ -12736,7 +12704,7 @@
           </mc:Choice>
           <mc:Fallback>
             <w:pict>
-              <v:rect w14:anchorId="799DE21D" id="Rectangle 1" o:spid="_x0000_s1026" style="position:absolute;margin-left:-12.55pt;margin-top:4.15pt;width:474pt;height:494pt;z-index:251734016;visibility:visible;mso-wrap-style:square;mso-height-percent:0;mso-wrap-distance-left:9pt;mso-wrap-distance-top:0;mso-wrap-distance-right:9pt;mso-wrap-distance-bottom:0;mso-position-horizontal:absolute;mso-position-horizontal-relative:text;mso-position-vertical:absolute;mso-position-vertical-relative:text;mso-height-percent:0;mso-height-relative:margin;v-text-anchor:middle" o:gfxdata="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" filled="f" strokecolor="#4e2319 [1604]" strokeweight="1pt"/>
+              <v:rect w14:anchorId="41F162B3" id="Rectangle 1" o:spid="_x0000_s1026" style="position:absolute;margin-left:-12.55pt;margin-top:4.15pt;width:474pt;height:494pt;z-index:251734016;visibility:visible;mso-wrap-style:square;mso-height-percent:0;mso-wrap-distance-left:9pt;mso-wrap-distance-top:0;mso-wrap-distance-right:9pt;mso-wrap-distance-bottom:0;mso-position-horizontal:absolute;mso-position-horizontal-relative:text;mso-position-vertical:absolute;mso-position-vertical-relative:text;mso-height-percent:0;mso-height-relative:margin;v-text-anchor:middle" o:gfxdata="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" filled="f" strokecolor="#4e2319 [1604]" strokeweight="1pt"/>
             </w:pict>
           </mc:Fallback>
         </mc:AlternateContent>
@@ -13147,7 +13115,7 @@
           </mc:Choice>
           <mc:Fallback>
             <w:pict>
-              <v:rect w14:anchorId="73B4C8A6" id="Rectangle 2" o:spid="_x0000_s1026" style="position:absolute;margin-left:-10.45pt;margin-top:8.35pt;width:474pt;height:504.55pt;z-index:251735040;visibility:visible;mso-wrap-style:square;mso-height-percent:0;mso-wrap-distance-left:9pt;mso-wrap-distance-top:0;mso-wrap-distance-right:9pt;mso-wrap-distance-bottom:0;mso-position-horizontal:absolute;mso-position-horizontal-relative:text;mso-position-vertical:absolute;mso-position-vertical-relative:text;mso-height-percent:0;mso-height-relative:margin;v-text-anchor:middle" o:gfxdata="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" filled="f" strokecolor="#4e2319 [1604]" strokeweight="1pt"/>
+              <v:rect w14:anchorId="6E4746E1" id="Rectangle 2" o:spid="_x0000_s1026" style="position:absolute;margin-left:-10.45pt;margin-top:8.35pt;width:474pt;height:504.55pt;z-index:251735040;visibility:visible;mso-wrap-style:square;mso-height-percent:0;mso-wrap-distance-left:9pt;mso-wrap-distance-top:0;mso-wrap-distance-right:9pt;mso-wrap-distance-bottom:0;mso-position-horizontal:absolute;mso-position-horizontal-relative:text;mso-position-vertical:absolute;mso-position-vertical-relative:text;mso-height-percent:0;mso-height-relative:margin;v-text-anchor:middle" o:gfxdata="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" filled="f" strokecolor="#4e2319 [1604]" strokeweight="1pt"/>
             </w:pict>
           </mc:Fallback>
         </mc:AlternateContent>
@@ -13582,7 +13550,7 @@
           <w:szCs w:val="24"/>
           <w:lang w:eastAsia="en-GB"/>
         </w:rPr>
-        <w:pict w14:anchorId="31492B3D">
+        <w:pict w14:anchorId="18A8D978">
           <v:rect id="_x0000_i1026" alt="" style="width:451.3pt;height:.05pt;mso-width-percent:0;mso-height-percent:0;mso-width-percent:0;mso-height-percent:0" o:hralign="center" o:hrstd="t" o:hr="t" fillcolor="#a0a0a0" stroked="f"/>
         </w:pict>
       </w:r>
@@ -14396,7 +14364,7 @@
           <w:szCs w:val="24"/>
           <w:lang w:eastAsia="en-GB"/>
         </w:rPr>
-        <w:pict w14:anchorId="07DFE0F3">
+        <w:pict w14:anchorId="21F33B72">
           <v:rect id="_x0000_i1025" alt="" style="width:451.3pt;height:.05pt;mso-width-percent:0;mso-height-percent:0;mso-width-percent:0;mso-height-percent:0" o:hralign="center" o:hrstd="t" o:hr="t" fillcolor="#a0a0a0" stroked="f"/>
         </w:pict>
       </w:r>
@@ -15177,7 +15145,13 @@
 </file>
 
 <file path=word/footer2.xml><?xml version="1.0" encoding="utf-8"?>
-<w:ftr xmlns:wpc="http://schemas.microsoft.com/office/word/2010/wordprocessingCanvas" xmlns:cx="http://schemas.microsoft.com/office/drawing/2014/chartex" xmlns:cx1="http://schemas.microsoft.com/office/drawing/2015/9/8/chartex" xmlns:cx2="http://schemas.microsoft.com/office/drawing/2015/10/21/chartex" xmlns:cx3="http://schemas.microsoft.com/office/drawing/2016/5/9/chartex" xmlns:cx4="http://schemas.microsoft.com/office/drawing/2016/5/10/chartex" xmlns:cx5="http://schemas.microsoft.com/office/drawing/2016/5/11/chartex" xmlns:cx6="http://schemas.microsoft.com/office/drawing/2016/5/12/chartex" xmlns:cx7="http://schemas.microsoft.com/office/drawing/2016/5/13/chartex" xmlns:cx8="http://schemas.microsoft.com/office/drawing/2016/5/14/chartex" xmlns:mc="http://schemas.openxmlformats.org/markup-compatibility/2006" xmlns:aink="http://schemas.microsoft.com/office/drawing/2016/ink" xmlns:am3d="http://schemas.microsoft.com/office/drawing/2017/model3d" xmlns:o="urn:schemas-microsoft-com:office:office" xmlns:oel="http://schemas.microsoft.com/office/2019/extlst" xmlns:r="http://schemas.openxmlformats.org/officeDocument/2006/relationships" xmlns:m="http://schemas.openxmlformats.org/officeDocument/2006/math" xmlns:v="urn:schemas-microsoft-com:vml" xmlns:wp14="http://schemas.microsoft.com/office/word/2010/wordprocessingDrawing" xmlns:wp="http://schemas.openxmlformats.org/drawingml/2006/wordprocessingDrawing" xmlns:w10="urn:schemas-microsoft-com:office:word" xmlns:w="http://schemas.openxmlformats.org/wordprocessingml/2006/main" xmlns:w14="http://schemas.microsoft.com/office/word/2010/wordml" xmlns:w15="http://schemas.microsoft.com/office/word/2012/wordml" xmlns:w16cex="http://schemas.microsoft.com/office/word/2018/wordml/cex" xmlns:w16cid="http://schemas.microsoft.com/office/word/2016/wordml/cid" xmlns:w16="http://schemas.microsoft.com/office/word/2018/wordml" xmlns:w16du="http://schemas.microsoft.com/office/word/2023/wordml/word16du" xmlns:w16sdtdh="http://schemas.microsoft.com/office/word/2020/wordml/sdtdatahash" xmlns:w16sdtfl="http://schemas.microsoft.com/office/word/2024/wordml/sdtformatlock" xmlns:w16se="http://schemas.microsoft.com/office/word/2015/wordml/symex" xmlns:wpg="http://schemas.microsoft.com/office/word/2010/wordprocessingGroup" xmlns:wpi="http://schemas.microsoft.com/office/word/2010/wordprocessingInk" xmlns:wne="http://schemas.microsoft.com/office/word/2006/wordml" xmlns:wps="http://schemas.microsoft.com/office/word/2010/wordprocessingShape" mc:Ignorable="w14 w15 w16se w16cid w16 w16cex w16sdtdh w16sdtfl w16du wp14"/>
+<w:ftr xmlns:wpc="http://schemas.microsoft.com/office/word/2010/wordprocessingCanvas" xmlns:cx="http://schemas.microsoft.com/office/drawing/2014/chartex" xmlns:cx1="http://schemas.microsoft.com/office/drawing/2015/9/8/chartex" xmlns:cx2="http://schemas.microsoft.com/office/drawing/2015/10/21/chartex" xmlns:cx3="http://schemas.microsoft.com/office/drawing/2016/5/9/chartex" xmlns:cx4="http://schemas.microsoft.com/office/drawing/2016/5/10/chartex" xmlns:cx5="http://schemas.microsoft.com/office/drawing/2016/5/11/chartex" xmlns:cx6="http://schemas.microsoft.com/office/drawing/2016/5/12/chartex" xmlns:cx7="http://schemas.microsoft.com/office/drawing/2016/5/13/chartex" xmlns:cx8="http://schemas.microsoft.com/office/drawing/2016/5/14/chartex" xmlns:mc="http://schemas.openxmlformats.org/markup-compatibility/2006" xmlns:aink="http://schemas.microsoft.com/office/drawing/2016/ink" xmlns:am3d="http://schemas.microsoft.com/office/drawing/2017/model3d" xmlns:o="urn:schemas-microsoft-com:office:office" xmlns:oel="http://schemas.microsoft.com/office/2019/extlst" xmlns:r="http://schemas.openxmlformats.org/officeDocument/2006/relationships" xmlns:m="http://schemas.openxmlformats.org/officeDocument/2006/math" xmlns:v="urn:schemas-microsoft-com:vml" xmlns:wp14="http://schemas.microsoft.com/office/word/2010/wordprocessingDrawing" xmlns:wp="http://schemas.openxmlformats.org/drawingml/2006/wordprocessingDrawing" xmlns:w10="urn:schemas-microsoft-com:office:word" xmlns:w="http://schemas.openxmlformats.org/wordprocessingml/2006/main" xmlns:w14="http://schemas.microsoft.com/office/word/2010/wordml" xmlns:w15="http://schemas.microsoft.com/office/word/2012/wordml" xmlns:w16cex="http://schemas.microsoft.com/office/word/2018/wordml/cex" xmlns:w16cid="http://schemas.microsoft.com/office/word/2016/wordml/cid" xmlns:w16="http://schemas.microsoft.com/office/word/2018/wordml" xmlns:w16du="http://schemas.microsoft.com/office/word/2023/wordml/word16du" xmlns:w16sdtdh="http://schemas.microsoft.com/office/word/2020/wordml/sdtdatahash" xmlns:w16sdtfl="http://schemas.microsoft.com/office/word/2024/wordml/sdtformatlock" xmlns:w16se="http://schemas.microsoft.com/office/word/2015/wordml/symex" xmlns:wpg="http://schemas.microsoft.com/office/word/2010/wordprocessingGroup" xmlns:wpi="http://schemas.microsoft.com/office/word/2010/wordprocessingInk" xmlns:wne="http://schemas.microsoft.com/office/word/2006/wordml" xmlns:wps="http://schemas.microsoft.com/office/word/2010/wordprocessingShape" mc:Ignorable="w14 w15 w16se w16cid w16 w16cex w16sdtdh w16sdtfl w16du wp14">
+  <w:p>
+    <w:r>
+      <w:cr/>
+    </w:r>
+  </w:p>
+</w:ftr>
 </file>
 
 <file path=word/footer3.xml><?xml version="1.0" encoding="utf-8"?>
@@ -15225,7 +15199,7 @@
       <w:rPr>
         <w:noProof/>
       </w:rPr>
-      <w:pict w14:anchorId="34007BA2">
+      <w:pict w14:anchorId="29EE549B">
         <v:shapetype id="_x0000_t136" coordsize="21600,21600" o:spt="136" adj="10800" path="m@7,l@8,m@5,21600l@6,21600e">
           <v:formulas>
             <v:f eqn="sum #0 0 10800"/>
@@ -15250,9 +15224,10 @@
           </v:handles>
           <o:lock v:ext="edit" text="t" shapetype="t"/>
         </v:shapetype>
-        <v:shape id="PowerPlusWaterMarkObject11161269" o:spid="_x0000_s1027" type="#_x0000_t136" alt="" style="position:absolute;margin-left:0;margin-top:0;width:528.3pt;height:176.1pt;rotation:315;z-index:-251651072;mso-wrap-edited:f;mso-width-percent:0;mso-height-percent:0;mso-position-horizontal:center;mso-position-horizontal-relative:margin;mso-position-vertical:center;mso-position-vertical-relative:margin;mso-width-percent:0;mso-height-percent:0" o:allowincell="f" fillcolor="#e00" stroked="f">
-          <v:fill opacity="34078f"/>
+        <v:shape id="PowerPlusWaterMarkObject11716819" o:spid="_x0000_s1027" type="#_x0000_t136" alt="" style="position:absolute;margin-left:0;margin-top:0;width:528.3pt;height:176.1pt;rotation:315;z-index:-251630592;mso-wrap-edited:f;mso-width-percent:0;mso-height-percent:0;mso-position-horizontal:center;mso-position-horizontal-relative:margin;mso-position-vertical:center;mso-position-vertical-relative:margin;mso-width-percent:0;mso-height-percent:0" o:allowincell="f" fillcolor="#e00" stroked="f">
+          <v:fill opacity="2621f"/>
           <v:textpath style="font-family:&quot;Century Gothic&quot;;font-size:1pt" string="SAMPLE"/>
+          <w10:wrap anchorx="margin" anchory="margin"/>
         </v:shape>
       </w:pict>
     </w:r>
@@ -15270,7 +15245,7 @@
       <w:rPr>
         <w:noProof/>
       </w:rPr>
-      <w:pict w14:anchorId="598640C3">
+      <w:pict w14:anchorId="53073C82">
         <v:shapetype id="_x0000_t136" coordsize="21600,21600" o:spt="136" adj="10800" path="m@7,l@8,m@5,21600l@6,21600e">
           <v:formulas>
             <v:f eqn="sum #0 0 10800"/>
@@ -15295,9 +15270,10 @@
           </v:handles>
           <o:lock v:ext="edit" text="t" shapetype="t"/>
         </v:shapetype>
-        <v:shape id="PowerPlusWaterMarkObject11161270" o:spid="_x0000_s1026" type="#_x0000_t136" alt="" style="position:absolute;margin-left:0;margin-top:0;width:528.3pt;height:176.1pt;rotation:315;z-index:-251646976;mso-wrap-edited:f;mso-width-percent:0;mso-height-percent:0;mso-position-horizontal:center;mso-position-horizontal-relative:margin;mso-position-vertical:center;mso-position-vertical-relative:margin;mso-width-percent:0;mso-height-percent:0" o:allowincell="f" fillcolor="#e00" stroked="f">
-          <v:fill opacity="34078f"/>
+        <v:shape id="PowerPlusWaterMarkObject11716820" o:spid="_x0000_s1026" type="#_x0000_t136" alt="" style="position:absolute;margin-left:0;margin-top:0;width:528.3pt;height:176.1pt;rotation:315;z-index:-251628544;mso-wrap-edited:f;mso-width-percent:0;mso-height-percent:0;mso-position-horizontal:center;mso-position-horizontal-relative:margin;mso-position-vertical:center;mso-position-vertical-relative:margin;mso-width-percent:0;mso-height-percent:0" o:allowincell="f" fillcolor="#e00" stroked="f">
+          <v:fill opacity="2621f"/>
           <v:textpath style="font-family:&quot;Century Gothic&quot;;font-size:1pt" string="SAMPLE"/>
+          <w10:wrap anchorx="margin" anchory="margin"/>
         </v:shape>
       </w:pict>
     </w:r>
@@ -15315,7 +15291,7 @@
       <w:rPr>
         <w:noProof/>
       </w:rPr>
-      <w:pict w14:anchorId="4EAB9A67">
+      <w:pict w14:anchorId="5F3D9E05">
         <v:shapetype id="_x0000_t136" coordsize="21600,21600" o:spt="136" adj="10800" path="m@7,l@8,m@5,21600l@6,21600e">
           <v:formulas>
             <v:f eqn="sum #0 0 10800"/>
@@ -15340,9 +15316,10 @@
           </v:handles>
           <o:lock v:ext="edit" text="t" shapetype="t"/>
         </v:shapetype>
-        <v:shape id="PowerPlusWaterMarkObject11161268" o:spid="_x0000_s1025" type="#_x0000_t136" alt="" style="position:absolute;margin-left:0;margin-top:0;width:528.3pt;height:176.1pt;rotation:315;z-index:-251655168;mso-wrap-edited:f;mso-width-percent:0;mso-height-percent:0;mso-position-horizontal:center;mso-position-horizontal-relative:margin;mso-position-vertical:center;mso-position-vertical-relative:margin;mso-width-percent:0;mso-height-percent:0" o:allowincell="f" fillcolor="#e00" stroked="f">
-          <v:fill opacity="34078f"/>
+        <v:shape id="PowerPlusWaterMarkObject11716818" o:spid="_x0000_s1025" type="#_x0000_t136" alt="" style="position:absolute;margin-left:0;margin-top:0;width:528.3pt;height:176.1pt;rotation:315;z-index:-251632640;mso-wrap-edited:f;mso-width-percent:0;mso-height-percent:0;mso-position-horizontal:center;mso-position-horizontal-relative:margin;mso-position-vertical:center;mso-position-vertical-relative:margin;mso-width-percent:0;mso-height-percent:0" o:allowincell="f" fillcolor="#e00" stroked="f">
+          <v:fill opacity="2621f"/>
           <v:textpath style="font-family:&quot;Century Gothic&quot;;font-size:1pt" string="SAMPLE"/>
+          <w10:wrap anchorx="margin" anchory="margin"/>
         </v:shape>
       </w:pict>
     </w:r>
@@ -19935,8 +19912,10 @@
     <w:compatSetting w:name="useWord2013TrackBottomHyphenation" w:uri="http://schemas.microsoft.com/office/word" w:val="0"/>
   </w:compat>
   <w:rsids>
-    <w:rsidRoot w:val="00A33A7F"/>
-    <w:rsid w:val="00A33A7F"/>
+    <w:rsidRoot w:val="00C96ACF"/>
+    <w:rsid w:val="008B5E53"/>
+    <w:rsid w:val="00A618AC"/>
+    <w:rsid w:val="00C96ACF"/>
     <w:rsid w:val="00CF5BFA"/>
   </w:rsids>
   <m:mathPr>
@@ -20391,42 +20370,6 @@
   <w:style w:type="paragraph" w:customStyle="1" w:styleId="EE1C36701464144AAD559AFE6EF0FEC9">
     <w:name w:val="EE1C36701464144AAD559AFE6EF0FEC9"/>
   </w:style>
-  <w:style w:type="paragraph" w:customStyle="1" w:styleId="3558F5EE0E2BB745AE0F8600567409A6">
-    <w:name w:val="3558F5EE0E2BB745AE0F8600567409A6"/>
-  </w:style>
-  <w:style w:type="paragraph" w:customStyle="1" w:styleId="712577615711004EB7C1659750040632">
-    <w:name w:val="712577615711004EB7C1659750040632"/>
-  </w:style>
-  <w:style w:type="paragraph" w:customStyle="1" w:styleId="E51D3B9E6B73B340BE684940390804E3">
-    <w:name w:val="E51D3B9E6B73B340BE684940390804E3"/>
-  </w:style>
-  <w:style w:type="paragraph" w:customStyle="1" w:styleId="F06DE6EEAC5812428614709F4485F20C">
-    <w:name w:val="F06DE6EEAC5812428614709F4485F20C"/>
-  </w:style>
-  <w:style w:type="paragraph" w:customStyle="1" w:styleId="779BA5904D791B4CA7C20D79636AA7A7">
-    <w:name w:val="779BA5904D791B4CA7C20D79636AA7A7"/>
-  </w:style>
-  <w:style w:type="paragraph" w:customStyle="1" w:styleId="39EAF63FE1F40F40BD60E65C4126C97D">
-    <w:name w:val="39EAF63FE1F40F40BD60E65C4126C97D"/>
-  </w:style>
-  <w:style w:type="paragraph" w:customStyle="1" w:styleId="930282074AD6604B9D7854AB3742886C">
-    <w:name w:val="930282074AD6604B9D7854AB3742886C"/>
-  </w:style>
-  <w:style w:type="paragraph" w:customStyle="1" w:styleId="AB5599E79933E049B41295626614C2B6">
-    <w:name w:val="AB5599E79933E049B41295626614C2B6"/>
-  </w:style>
-  <w:style w:type="paragraph" w:customStyle="1" w:styleId="8206092C957BAB468C1AEF0B0F96DC61">
-    <w:name w:val="8206092C957BAB468C1AEF0B0F96DC61"/>
-  </w:style>
-  <w:style w:type="paragraph" w:customStyle="1" w:styleId="B22A98CC043228409DA3DA0A1A0187F0">
-    <w:name w:val="B22A98CC043228409DA3DA0A1A0187F0"/>
-  </w:style>
-  <w:style w:type="paragraph" w:customStyle="1" w:styleId="B59817F0F269954996BDA8DBA32CFA27">
-    <w:name w:val="B59817F0F269954996BDA8DBA32CFA27"/>
-  </w:style>
-  <w:style w:type="paragraph" w:customStyle="1" w:styleId="CC1F2D2BB5D2304A88D2714648212122">
-    <w:name w:val="CC1F2D2BB5D2304A88D2714648212122"/>
-  </w:style>
 </w:styles>
 </file>
 

</xml_diff>